<commit_message>
added screenshots of all the levels
</commit_message>
<xml_diff>
--- a/task-1/bandit/bandit screenshots.docx
+++ b/task-1/bandit/bandit screenshots.docx
@@ -1008,6 +1008,7 @@
       </w:pPr>
       <w:r>
         <w:rPr>
+          <w:noProof/>
           <w:lang w:val="en-US"/>
         </w:rPr>
         <w:drawing>
@@ -1068,6 +1069,7 @@
       </w:pPr>
       <w:r>
         <w:rPr>
+          <w:noProof/>
           <w:lang w:val="en-US"/>
         </w:rPr>
         <w:drawing>
@@ -1108,6 +1110,7 @@
       </w:r>
       <w:r>
         <w:rPr>
+          <w:noProof/>
           <w:lang w:val="en-US"/>
         </w:rPr>
         <w:drawing>
@@ -1162,6 +1165,9 @@
     </w:p>
     <w:p>
       <w:r>
+        <w:rPr>
+          <w:noProof/>
+        </w:rPr>
         <w:drawing>
           <wp:inline distT="0" distB="0" distL="0" distR="0" wp14:anchorId="661F648C" wp14:editId="30EB0C7D">
             <wp:extent cx="5731510" cy="4034790"/>
@@ -1201,6 +1207,9 @@
     </w:p>
     <w:p>
       <w:r>
+        <w:rPr>
+          <w:noProof/>
+        </w:rPr>
         <w:lastRenderedPageBreak/>
         <w:drawing>
           <wp:inline distT="0" distB="0" distL="0" distR="0" wp14:anchorId="7148648C" wp14:editId="695CDFBD">
@@ -1246,13 +1255,227 @@
           <w:lang w:val="en-US"/>
         </w:rPr>
       </w:pPr>
-    </w:p>
-    <w:p>
-      <w:pPr>
-        <w:rPr>
-          <w:lang w:val="en-US"/>
-        </w:rPr>
-      </w:pPr>
+      <w:r>
+        <w:rPr>
+          <w:lang w:val="en-US"/>
+        </w:rPr>
+        <w:drawing>
+          <wp:inline distT="0" distB="0" distL="0" distR="0" wp14:anchorId="0CC6DDBE" wp14:editId="5832464B">
+            <wp:extent cx="5731510" cy="4584700"/>
+            <wp:effectExtent l="0" t="0" r="2540" b="6350"/>
+            <wp:docPr id="591741587" name="Picture 1"/>
+            <wp:cNvGraphicFramePr>
+              <a:graphicFrameLocks xmlns:a="http://schemas.openxmlformats.org/drawingml/2006/main" noChangeAspect="1"/>
+            </wp:cNvGraphicFramePr>
+            <a:graphic xmlns:a="http://schemas.openxmlformats.org/drawingml/2006/main">
+              <a:graphicData uri="http://schemas.openxmlformats.org/drawingml/2006/picture">
+                <pic:pic xmlns:pic="http://schemas.openxmlformats.org/drawingml/2006/picture">
+                  <pic:nvPicPr>
+                    <pic:cNvPr id="591741587" name=""/>
+                    <pic:cNvPicPr/>
+                  </pic:nvPicPr>
+                  <pic:blipFill>
+                    <a:blip r:embed="rId25"/>
+                    <a:stretch>
+                      <a:fillRect/>
+                    </a:stretch>
+                  </pic:blipFill>
+                  <pic:spPr>
+                    <a:xfrm>
+                      <a:off x="0" y="0"/>
+                      <a:ext cx="5731510" cy="4584700"/>
+                    </a:xfrm>
+                    <a:prstGeom prst="rect">
+                      <a:avLst/>
+                    </a:prstGeom>
+                  </pic:spPr>
+                </pic:pic>
+              </a:graphicData>
+            </a:graphic>
+          </wp:inline>
+        </w:drawing>
+      </w:r>
+    </w:p>
+    <w:p>
+      <w:pPr>
+        <w:rPr>
+          <w:lang w:val="en-US"/>
+        </w:rPr>
+      </w:pPr>
+      <w:r>
+        <w:rPr>
+          <w:lang w:val="en-US"/>
+        </w:rPr>
+        <w:t>Level 17-18:</w:t>
+      </w:r>
+    </w:p>
+    <w:p>
+      <w:pPr>
+        <w:rPr>
+          <w:lang w:val="en-US"/>
+        </w:rPr>
+      </w:pPr>
+      <w:r>
+        <w:rPr>
+          <w:lang w:val="en-US"/>
+        </w:rPr>
+        <w:drawing>
+          <wp:inline distT="0" distB="0" distL="0" distR="0" wp14:anchorId="7CF4A243" wp14:editId="11EE2C5A">
+            <wp:extent cx="5731510" cy="1772920"/>
+            <wp:effectExtent l="0" t="0" r="2540" b="0"/>
+            <wp:docPr id="404542564" name="Picture 1"/>
+            <wp:cNvGraphicFramePr>
+              <a:graphicFrameLocks xmlns:a="http://schemas.openxmlformats.org/drawingml/2006/main" noChangeAspect="1"/>
+            </wp:cNvGraphicFramePr>
+            <a:graphic xmlns:a="http://schemas.openxmlformats.org/drawingml/2006/main">
+              <a:graphicData uri="http://schemas.openxmlformats.org/drawingml/2006/picture">
+                <pic:pic xmlns:pic="http://schemas.openxmlformats.org/drawingml/2006/picture">
+                  <pic:nvPicPr>
+                    <pic:cNvPr id="404542564" name=""/>
+                    <pic:cNvPicPr/>
+                  </pic:nvPicPr>
+                  <pic:blipFill>
+                    <a:blip r:embed="rId26"/>
+                    <a:stretch>
+                      <a:fillRect/>
+                    </a:stretch>
+                  </pic:blipFill>
+                  <pic:spPr>
+                    <a:xfrm>
+                      <a:off x="0" y="0"/>
+                      <a:ext cx="5731510" cy="1772920"/>
+                    </a:xfrm>
+                    <a:prstGeom prst="rect">
+                      <a:avLst/>
+                    </a:prstGeom>
+                  </pic:spPr>
+                </pic:pic>
+              </a:graphicData>
+            </a:graphic>
+          </wp:inline>
+        </w:drawing>
+      </w:r>
+    </w:p>
+    <w:p>
+      <w:pPr>
+        <w:rPr>
+          <w:lang w:val="en-US"/>
+        </w:rPr>
+      </w:pPr>
+      <w:r>
+        <w:rPr>
+          <w:lang w:val="en-US"/>
+        </w:rPr>
+        <w:t>Level18-19:</w:t>
+      </w:r>
+    </w:p>
+    <w:p>
+      <w:pPr>
+        <w:rPr>
+          <w:lang w:val="en-US"/>
+        </w:rPr>
+      </w:pPr>
+      <w:r>
+        <w:rPr>
+          <w:lang w:val="en-US"/>
+        </w:rPr>
+        <w:lastRenderedPageBreak/>
+        <w:drawing>
+          <wp:inline distT="0" distB="0" distL="0" distR="0" wp14:anchorId="7FEA8B41" wp14:editId="5A3C039B">
+            <wp:extent cx="5731510" cy="2326005"/>
+            <wp:effectExtent l="0" t="0" r="2540" b="0"/>
+            <wp:docPr id="618192332" name="Picture 1"/>
+            <wp:cNvGraphicFramePr>
+              <a:graphicFrameLocks xmlns:a="http://schemas.openxmlformats.org/drawingml/2006/main" noChangeAspect="1"/>
+            </wp:cNvGraphicFramePr>
+            <a:graphic xmlns:a="http://schemas.openxmlformats.org/drawingml/2006/main">
+              <a:graphicData uri="http://schemas.openxmlformats.org/drawingml/2006/picture">
+                <pic:pic xmlns:pic="http://schemas.openxmlformats.org/drawingml/2006/picture">
+                  <pic:nvPicPr>
+                    <pic:cNvPr id="618192332" name=""/>
+                    <pic:cNvPicPr/>
+                  </pic:nvPicPr>
+                  <pic:blipFill>
+                    <a:blip r:embed="rId27"/>
+                    <a:stretch>
+                      <a:fillRect/>
+                    </a:stretch>
+                  </pic:blipFill>
+                  <pic:spPr>
+                    <a:xfrm>
+                      <a:off x="0" y="0"/>
+                      <a:ext cx="5731510" cy="2326005"/>
+                    </a:xfrm>
+                    <a:prstGeom prst="rect">
+                      <a:avLst/>
+                    </a:prstGeom>
+                  </pic:spPr>
+                </pic:pic>
+              </a:graphicData>
+            </a:graphic>
+          </wp:inline>
+        </w:drawing>
+      </w:r>
+    </w:p>
+    <w:p>
+      <w:pPr>
+        <w:rPr>
+          <w:lang w:val="en-US"/>
+        </w:rPr>
+      </w:pPr>
+      <w:r>
+        <w:rPr>
+          <w:lang w:val="en-US"/>
+        </w:rPr>
+        <w:t>Level 19-20:</w:t>
+      </w:r>
+    </w:p>
+    <w:p>
+      <w:pPr>
+        <w:rPr>
+          <w:lang w:val="en-US"/>
+        </w:rPr>
+      </w:pPr>
+      <w:r>
+        <w:rPr>
+          <w:lang w:val="en-US"/>
+        </w:rPr>
+        <w:drawing>
+          <wp:inline distT="0" distB="0" distL="0" distR="0" wp14:anchorId="05B22A78" wp14:editId="199053ED">
+            <wp:extent cx="5731510" cy="1400810"/>
+            <wp:effectExtent l="0" t="0" r="2540" b="8890"/>
+            <wp:docPr id="2000872021" name="Picture 1"/>
+            <wp:cNvGraphicFramePr>
+              <a:graphicFrameLocks xmlns:a="http://schemas.openxmlformats.org/drawingml/2006/main" noChangeAspect="1"/>
+            </wp:cNvGraphicFramePr>
+            <a:graphic xmlns:a="http://schemas.openxmlformats.org/drawingml/2006/main">
+              <a:graphicData uri="http://schemas.openxmlformats.org/drawingml/2006/picture">
+                <pic:pic xmlns:pic="http://schemas.openxmlformats.org/drawingml/2006/picture">
+                  <pic:nvPicPr>
+                    <pic:cNvPr id="2000872021" name=""/>
+                    <pic:cNvPicPr/>
+                  </pic:nvPicPr>
+                  <pic:blipFill>
+                    <a:blip r:embed="rId28"/>
+                    <a:stretch>
+                      <a:fillRect/>
+                    </a:stretch>
+                  </pic:blipFill>
+                  <pic:spPr>
+                    <a:xfrm>
+                      <a:off x="0" y="0"/>
+                      <a:ext cx="5731510" cy="1400810"/>
+                    </a:xfrm>
+                    <a:prstGeom prst="rect">
+                      <a:avLst/>
+                    </a:prstGeom>
+                  </pic:spPr>
+                </pic:pic>
+              </a:graphicData>
+            </a:graphic>
+          </wp:inline>
+        </w:drawing>
+      </w:r>
     </w:p>
     <w:sectPr>
       <w:pgSz w:w="11906" w:h="16838"/>

</xml_diff>